<commit_message>
Atualiza documento de recursos (.docx) com Magias, Grimorio e auditoria
- Nova secao Magias e Grimorio; linha de magias na tabela
- Testes atualizados (113 verificacoes); GitHub Pages na secao de uso
- Marca dagua Pro=RPG mantida

Co-Authored-By: Claude Opus 4.8 <noreply@anthropic.com>
</commit_message>
<xml_diff>
--- a/RECURSOS-DA-FICHA.docx
+++ b/RECURSOS-DA-FICHA.docx
@@ -115,7 +115,7 @@
       <w:r>
         <w:t xml:space="preserve">No ar: </w:t>
       </w:r>
-      <w:hyperlink w:history="1" r:id="rIdgsfvbqu_h8nzo53jhvx6f">
+      <w:hyperlink w:history="1" r:id="rIdsxfb1ffxurs63vfounbpo">
         <w:r>
           <w:rPr>
             <w:rStyle w:val="Hyperlink"/>
@@ -1684,6 +1684,95 @@
           </w:p>
         </w:tc>
       </w:tr>
+      <w:tr>
+        <w:tc>
+          <w:tcPr>
+            <w:tcW w:type="dxa" w:w="3500"/>
+            <w:tcBorders>
+              <w:top w:val="single" w:color="D8C9A8" w:sz="1"/>
+              <w:left w:val="single" w:color="D8C9A8" w:sz="1"/>
+              <w:bottom w:val="single" w:color="D8C9A8" w:sz="1"/>
+              <w:right w:val="single" w:color="D8C9A8" w:sz="1"/>
+            </w:tcBorders>
+            <w:shd w:fill="FBF6EA" w:val="clear"/>
+            <w:tcMar>
+              <w:top w:type="dxa" w:w="60"/>
+              <w:left w:type="dxa" w:w="120"/>
+              <w:bottom w:type="dxa" w:w="60"/>
+              <w:right w:type="dxa" w:w="120"/>
+            </w:tcMar>
+          </w:tcPr>
+          <w:p>
+            <w:r>
+              <w:rPr>
+                <w:b w:val="false"/>
+                <w:bCs w:val="false"/>
+                <w:color w:val="2B2118"/>
+              </w:rPr>
+              <w:t xml:space="preserve">Magias (Livro do Jogador 2024)</w:t>
+            </w:r>
+          </w:p>
+        </w:tc>
+        <w:tc>
+          <w:tcPr>
+            <w:tcW w:type="dxa" w:w="1300"/>
+            <w:tcBorders>
+              <w:top w:val="single" w:color="D8C9A8" w:sz="1"/>
+              <w:left w:val="single" w:color="D8C9A8" w:sz="1"/>
+              <w:bottom w:val="single" w:color="D8C9A8" w:sz="1"/>
+              <w:right w:val="single" w:color="D8C9A8" w:sz="1"/>
+            </w:tcBorders>
+            <w:shd w:fill="FBF6EA" w:val="clear"/>
+            <w:tcMar>
+              <w:top w:type="dxa" w:w="60"/>
+              <w:left w:type="dxa" w:w="120"/>
+              <w:bottom w:type="dxa" w:w="60"/>
+              <w:right w:type="dxa" w:w="120"/>
+            </w:tcMar>
+          </w:tcPr>
+          <w:p>
+            <w:pPr>
+              <w:jc w:val="center"/>
+            </w:pPr>
+            <w:r>
+              <w:rPr>
+                <w:b w:val="false"/>
+                <w:bCs w:val="false"/>
+                <w:color w:val="2B2118"/>
+              </w:rPr>
+              <w:t xml:space="preserve">387</w:t>
+            </w:r>
+          </w:p>
+        </w:tc>
+        <w:tc>
+          <w:tcPr>
+            <w:tcW w:type="dxa" w:w="4560"/>
+            <w:tcBorders>
+              <w:top w:val="single" w:color="D8C9A8" w:sz="1"/>
+              <w:left w:val="single" w:color="D8C9A8" w:sz="1"/>
+              <w:bottom w:val="single" w:color="D8C9A8" w:sz="1"/>
+              <w:right w:val="single" w:color="D8C9A8" w:sz="1"/>
+            </w:tcBorders>
+            <w:shd w:fill="FBF6EA" w:val="clear"/>
+            <w:tcMar>
+              <w:top w:type="dxa" w:w="60"/>
+              <w:left w:type="dxa" w:w="120"/>
+              <w:bottom w:type="dxa" w:w="60"/>
+              <w:right w:type="dxa" w:w="120"/>
+            </w:tcMar>
+          </w:tcPr>
+          <w:p>
+            <w:r>
+              <w:rPr>
+                <w:b w:val="false"/>
+                <w:bCs w:val="false"/>
+                <w:color w:val="2B2118"/>
+              </w:rPr>
+              <w:t xml:space="preserve">selecionáveis por classe e círculo; 384 com resumo em PT no Grimório</w:t>
+            </w:r>
+          </w:p>
+        </w:tc>
+      </w:tr>
     </w:tbl>
     <w:p>
       <w:pPr>
@@ -2130,309 +2219,430 @@
         <w:pStyle w:val="Heading1"/>
       </w:pPr>
       <w:r>
-        <w:t xml:space="preserve">7. Recursos de classe e emblemas</w:t>
-      </w:r>
-    </w:p>
-    <w:p>
-      <w:pPr>
-        <w:pStyle w:val="ListParagraph"/>
-        <w:numPr>
-          <w:ilvl w:val="0"/>
-          <w:numId w:val="2"/>
-        </w:numPr>
-        <w:spacing w:after="60"/>
-      </w:pPr>
-      <w:r>
-        <w:t xml:space="preserve">Trackers de recursos por classe (atual/máx) para as 18 classes — Mana, Sangue-Frio, Fúrias, Energia/Engenho, Fragmentos de Alma, Foco etc.</w:t>
-      </w:r>
-    </w:p>
-    <w:p>
-      <w:pPr>
-        <w:pStyle w:val="ListParagraph"/>
-        <w:numPr>
-          <w:ilvl w:val="0"/>
-          <w:numId w:val="2"/>
-        </w:numPr>
-        <w:spacing w:after="60"/>
-      </w:pPr>
-      <w:r>
-        <w:t xml:space="preserve">Emblema/medalhão por classe (19 desenhos SVG); o Paladino usa o logo real Pró=RPG.</w:t>
-      </w:r>
-    </w:p>
-    <w:p>
-      <w:pPr>
-        <w:pStyle w:val="Heading1"/>
-      </w:pPr>
-      <w:r>
-        <w:t xml:space="preserve">8. Bônus automáticos e vantagens/desvantagens</w:t>
-      </w:r>
-    </w:p>
-    <w:p>
-      <w:pPr>
-        <w:pStyle w:val="ListParagraph"/>
-        <w:numPr>
-          <w:ilvl w:val="0"/>
-          <w:numId w:val="2"/>
-        </w:numPr>
-        <w:spacing w:after="60"/>
-      </w:pPr>
-      <w:r>
-        <w:t xml:space="preserve">Mapa de bônus (47 entradas): aplica sozinho Iniciativa, CA, Percepção Passiva, PV/nível, testes por atributo/perícia/salvaguarda.</w:t>
-      </w:r>
-    </w:p>
-    <w:p>
-      <w:pPr>
-        <w:pStyle w:val="ListParagraph"/>
-        <w:numPr>
-          <w:ilvl w:val="0"/>
-          <w:numId w:val="2"/>
-        </w:numPr>
-        <w:spacing w:after="60"/>
-      </w:pPr>
-      <w:r>
-        <w:t xml:space="preserve">Vantagem/Desvantagem: perícias recebem ▲/▼; as demais aparecem no painel “Vantagens &amp; Desvantagens”, com o motivo.</w:t>
-      </w:r>
-    </w:p>
-    <w:p>
-      <w:pPr>
-        <w:pStyle w:val="ListParagraph"/>
-        <w:numPr>
-          <w:ilvl w:val="0"/>
-          <w:numId w:val="2"/>
-        </w:numPr>
-        <w:spacing w:after="60"/>
-      </w:pPr>
-      <w:r>
-        <w:t xml:space="preserve">Penalidade de armadura: médias/pesadas aplicam desvantagem em Furtividade automaticamente.</w:t>
-      </w:r>
-    </w:p>
-    <w:p>
-      <w:pPr>
-        <w:pStyle w:val="ListParagraph"/>
-        <w:numPr>
-          <w:ilvl w:val="0"/>
-          <w:numId w:val="2"/>
-        </w:numPr>
-        <w:spacing w:after="60"/>
-      </w:pPr>
-      <w:r>
-        <w:t xml:space="preserve">Contador de pontos de Qualidades × Defeitos.</w:t>
-      </w:r>
-    </w:p>
-    <w:p>
-      <w:pPr>
-        <w:pStyle w:val="ListParagraph"/>
-        <w:numPr>
-          <w:ilvl w:val="0"/>
-          <w:numId w:val="2"/>
-        </w:numPr>
-        <w:spacing w:after="60"/>
-      </w:pPr>
-      <w:r>
-        <w:t xml:space="preserve">Bônus Personalizados: 5 linhas livres para somar qualquer modificador.</w:t>
-      </w:r>
-    </w:p>
-    <w:p>
-      <w:pPr>
-        <w:pStyle w:val="Heading1"/>
-      </w:pPr>
-      <w:r>
-        <w:t xml:space="preserve">9. Salvamento, compartilhamento e impressão</w:t>
-      </w:r>
-    </w:p>
-    <w:p>
-      <w:pPr>
-        <w:pStyle w:val="ListParagraph"/>
-        <w:numPr>
-          <w:ilvl w:val="0"/>
-          <w:numId w:val="2"/>
-        </w:numPr>
-        <w:spacing w:after="60"/>
-      </w:pPr>
-      <w:r>
-        <w:t xml:space="preserve">Salvamento automático (localStorage) — cada pessoa guarda a própria ficha.</w:t>
-      </w:r>
-    </w:p>
-    <w:p>
-      <w:pPr>
-        <w:pStyle w:val="ListParagraph"/>
-        <w:numPr>
-          <w:ilvl w:val="0"/>
-          <w:numId w:val="2"/>
-        </w:numPr>
-        <w:spacing w:after="60"/>
-      </w:pPr>
-      <w:r>
-        <w:t xml:space="preserve">Exportar / Importar JSON — backup e transferência em arquivo.</w:t>
-      </w:r>
-    </w:p>
-    <w:p>
-      <w:pPr>
-        <w:pStyle w:val="ListParagraph"/>
-        <w:numPr>
-          <w:ilvl w:val="0"/>
-          <w:numId w:val="2"/>
-        </w:numPr>
-        <w:spacing w:after="60"/>
-      </w:pPr>
-      <w:r>
-        <w:t xml:space="preserve">Link da ficha — URL com a ficha embutida (após publicada; cai para JSON se for grande).</w:t>
-      </w:r>
-    </w:p>
-    <w:p>
-      <w:pPr>
-        <w:pStyle w:val="ListParagraph"/>
-        <w:numPr>
-          <w:ilvl w:val="0"/>
-          <w:numId w:val="2"/>
-        </w:numPr>
-        <w:spacing w:after="60"/>
-      </w:pPr>
-      <w:r>
-        <w:t xml:space="preserve">Salvar como PDF — via impressão do navegador, com layout próprio.</w:t>
-      </w:r>
-    </w:p>
-    <w:p>
-      <w:pPr>
-        <w:pStyle w:val="ListParagraph"/>
-        <w:numPr>
-          <w:ilvl w:val="0"/>
-          <w:numId w:val="2"/>
-        </w:numPr>
-        <w:spacing w:after="60"/>
-      </w:pPr>
-      <w:r>
-        <w:t xml:space="preserve">Painel “Descrição dos Itens Escolhidos” — resume cada item selecionado e as habilidades automáticas por nível.</w:t>
-      </w:r>
-    </w:p>
-    <w:p>
-      <w:pPr>
-        <w:pStyle w:val="Heading1"/>
-      </w:pPr>
-      <w:r>
-        <w:t xml:space="preserve">10. Como usar e publicar</w:t>
-      </w:r>
-    </w:p>
-    <w:p>
-      <w:pPr>
-        <w:pStyle w:val="ListParagraph"/>
-        <w:numPr>
-          <w:ilvl w:val="0"/>
-          <w:numId w:val="2"/>
-        </w:numPr>
-        <w:spacing w:after="60"/>
-      </w:pPr>
-      <w:r>
-        <w:t xml:space="preserve">Uso local: duplo-clique no arquivo Ficha-DnD-AliancaDeHerois.html.</w:t>
-      </w:r>
-    </w:p>
-    <w:p>
-      <w:pPr>
-        <w:pStyle w:val="ListParagraph"/>
-        <w:numPr>
-          <w:ilvl w:val="0"/>
-          <w:numId w:val="2"/>
-        </w:numPr>
-        <w:spacing w:after="60"/>
-      </w:pPr>
-      <w:r>
-        <w:t xml:space="preserve">Online: GitHub Pages (site estático; cada visitante mantém os próprios dados).</w:t>
-      </w:r>
-    </w:p>
-    <w:p>
-      <w:pPr>
-        <w:pStyle w:val="ListParagraph"/>
-        <w:numPr>
-          <w:ilvl w:val="0"/>
-          <w:numId w:val="2"/>
-        </w:numPr>
-        <w:spacing w:after="60"/>
-      </w:pPr>
-      <w:r>
-        <w:t xml:space="preserve">Compartilhar: envie o link do site; para uma ficha pronta, use “Link da ficha”.</w:t>
-      </w:r>
-    </w:p>
-    <w:p>
-      <w:pPr>
-        <w:pStyle w:val="Heading1"/>
-      </w:pPr>
-      <w:r>
-        <w:t xml:space="preserve">11. Qualidade / testes automatizados</w:t>
-      </w:r>
-    </w:p>
-    <w:p>
-      <w:pPr>
-        <w:spacing w:after="120"/>
-      </w:pPr>
-      <w:r>
-        <w:t xml:space="preserve">O projeto tem testes automatizados (Node.js + jsdom) que validam as regras a cada alteração:</w:t>
-      </w:r>
-    </w:p>
-    <w:p>
-      <w:pPr>
-        <w:pStyle w:val="ListParagraph"/>
-        <w:numPr>
-          <w:ilvl w:val="0"/>
-          <w:numId w:val="2"/>
-        </w:numPr>
-        <w:spacing w:after="60"/>
-      </w:pPr>
-      <w:r>
-        <w:t xml:space="preserve">syntax-check.js — sintaxe do JavaScript.</w:t>
-      </w:r>
-    </w:p>
-    <w:p>
-      <w:pPr>
-        <w:pStyle w:val="ListParagraph"/>
-        <w:numPr>
-          <w:ilvl w:val="0"/>
-          <w:numId w:val="2"/>
-        </w:numPr>
-        <w:spacing w:after="60"/>
-      </w:pPr>
-      <w:r>
-        <w:t xml:space="preserve">run-tests.js — repetição, validade por nível, ocultação de escolhidos, subclasse no 3º, soma de multiclasse.</w:t>
-      </w:r>
-    </w:p>
-    <w:p>
-      <w:pPr>
-        <w:pStyle w:val="ListParagraph"/>
-        <w:numPr>
-          <w:ilvl w:val="0"/>
-          <w:numId w:val="2"/>
-        </w:numPr>
-        <w:spacing w:after="60"/>
-      </w:pPr>
-      <w:r>
-        <w:t xml:space="preserve">check-multiclass-sub.js — subclasse nas classes de multiclasse.</w:t>
-      </w:r>
-    </w:p>
-    <w:p>
-      <w:pPr>
-        <w:pStyle w:val="ListParagraph"/>
-        <w:numPr>
-          <w:ilvl w:val="0"/>
-          <w:numId w:val="2"/>
-        </w:numPr>
-        <w:spacing w:after="60"/>
-      </w:pPr>
-      <w:r>
-        <w:t xml:space="preserve">check-talent-gate.js — talentos só na criação / via Aumento de Habilidade.</w:t>
-      </w:r>
-    </w:p>
-    <w:p>
-      <w:pPr>
-        <w:spacing w:after="120"/>
+        <w:t xml:space="preserve">7. Magias e Grimório</w:t>
+      </w:r>
+    </w:p>
+    <w:p>
+      <w:pPr>
+        <w:pStyle w:val="ListParagraph"/>
+        <w:numPr>
+          <w:ilvl w:val="0"/>
+          <w:numId w:val="2"/>
+        </w:numPr>
+        <w:spacing w:after="60"/>
       </w:pPr>
       <w:r>
         <w:rPr>
           <w:b/>
           <w:bCs/>
         </w:rPr>
+        <w:t xml:space="preserve">Seleção por classe e círculo:</w:t>
+      </w:r>
+      <w:r>
+        <w:t xml:space="preserve"> para cada classe conjuradora na ficha, um seletor mostra apenas as magias daquela classe e do círculo que o nível alcança (conjurador pleno = teto(nível/2); meio-conjurador = teto(nível/4); Bruxo inclui o Arcano Místico).</w:t>
+      </w:r>
+    </w:p>
+    <w:p>
+      <w:pPr>
+        <w:pStyle w:val="ListParagraph"/>
+        <w:numPr>
+          <w:ilvl w:val="0"/>
+          <w:numId w:val="2"/>
+        </w:numPr>
+        <w:spacing w:after="60"/>
+      </w:pPr>
+      <w:r>
+        <w:rPr>
+          <w:b/>
+          <w:bCs/>
+        </w:rPr>
+        <w:t xml:space="preserve">Limites por classe:</w:t>
+      </w:r>
+      <w:r>
+        <w:t xml:space="preserve"> contadores de Truques e de Magias preparadas/conhecidas (tabelas padrão 2024), que ficam vermelhos se excederem o teto.</w:t>
+      </w:r>
+    </w:p>
+    <w:p>
+      <w:pPr>
+        <w:pStyle w:val="ListParagraph"/>
+        <w:numPr>
+          <w:ilvl w:val="0"/>
+          <w:numId w:val="2"/>
+        </w:numPr>
+        <w:spacing w:after="60"/>
+      </w:pPr>
+      <w:r>
+        <w:rPr>
+          <w:b/>
+          <w:bCs/>
+        </w:rPr>
+        <w:t xml:space="preserve">Sem repetir:</w:t>
+      </w:r>
+      <w:r>
+        <w:t xml:space="preserve"> magias já escolhidas somem das opções; as escolhidas viram chips organizados por círculo, com a página do Livro do Jogador 2024.</w:t>
+      </w:r>
+    </w:p>
+    <w:p>
+      <w:pPr>
+        <w:pStyle w:val="ListParagraph"/>
+        <w:numPr>
+          <w:ilvl w:val="0"/>
+          <w:numId w:val="2"/>
+        </w:numPr>
+        <w:spacing w:after="60"/>
+      </w:pPr>
+      <w:r>
+        <w:rPr>
+          <w:b/>
+          <w:bCs/>
+        </w:rPr>
+        <w:t xml:space="preserve">Grimório (página final):</w:t>
+      </w:r>
+      <w:r>
+        <w:t xml:space="preserve"> as magias escolhidas aparecem por Truques e Círculos, com dados de conjuração (Tempo · Alcance · Componentes · Duração), página do livro, um resumo funcional em PT e um campo de anotação por magia.</w:t>
+      </w:r>
+    </w:p>
+    <w:p>
+      <w:pPr>
+        <w:pStyle w:val="ListParagraph"/>
+        <w:numPr>
+          <w:ilvl w:val="0"/>
+          <w:numId w:val="2"/>
+        </w:numPr>
+        <w:spacing w:after="60"/>
+      </w:pPr>
+      <w:r>
+        <w:rPr>
+          <w:b/>
+          <w:bCs/>
+        </w:rPr>
+        <w:t xml:space="preserve">Resumos:</w:t>
+      </w:r>
+      <w:r>
+        <w:t xml:space="preserve"> 384 das 387 magias têm resumo em português — descrições próprias e funcionais, baseadas no SRD 5.2 (CC-BY-4.0, com a atribuição exigida). O texto integral do livro NÃO é reproduzido.</w:t>
+      </w:r>
+    </w:p>
+    <w:p>
+      <w:pPr>
+        <w:pStyle w:val="Heading1"/>
+      </w:pPr>
+      <w:r>
+        <w:t xml:space="preserve">8. Recursos de classe e emblemas</w:t>
+      </w:r>
+    </w:p>
+    <w:p>
+      <w:pPr>
+        <w:pStyle w:val="ListParagraph"/>
+        <w:numPr>
+          <w:ilvl w:val="0"/>
+          <w:numId w:val="2"/>
+        </w:numPr>
+        <w:spacing w:after="60"/>
+      </w:pPr>
+      <w:r>
+        <w:t xml:space="preserve">Trackers de recursos por classe (atual/máx) para as 18 classes — Mana, Sangue-Frio, Fúrias, Energia/Engenho, Fragmentos de Alma, Foco etc.</w:t>
+      </w:r>
+    </w:p>
+    <w:p>
+      <w:pPr>
+        <w:pStyle w:val="ListParagraph"/>
+        <w:numPr>
+          <w:ilvl w:val="0"/>
+          <w:numId w:val="2"/>
+        </w:numPr>
+        <w:spacing w:after="60"/>
+      </w:pPr>
+      <w:r>
+        <w:t xml:space="preserve">Emblema/medalhão por classe (19 desenhos SVG); o Paladino usa o logo real Pró=RPG.</w:t>
+      </w:r>
+    </w:p>
+    <w:p>
+      <w:pPr>
+        <w:pStyle w:val="Heading1"/>
+      </w:pPr>
+      <w:r>
+        <w:t xml:space="preserve">9. Bônus automáticos e vantagens/desvantagens</w:t>
+      </w:r>
+    </w:p>
+    <w:p>
+      <w:pPr>
+        <w:pStyle w:val="ListParagraph"/>
+        <w:numPr>
+          <w:ilvl w:val="0"/>
+          <w:numId w:val="2"/>
+        </w:numPr>
+        <w:spacing w:after="60"/>
+      </w:pPr>
+      <w:r>
+        <w:t xml:space="preserve">Mapa de bônus (47 entradas): aplica sozinho Iniciativa, CA, Percepção Passiva, PV/nível, testes por atributo/perícia/salvaguarda.</w:t>
+      </w:r>
+    </w:p>
+    <w:p>
+      <w:pPr>
+        <w:pStyle w:val="ListParagraph"/>
+        <w:numPr>
+          <w:ilvl w:val="0"/>
+          <w:numId w:val="2"/>
+        </w:numPr>
+        <w:spacing w:after="60"/>
+      </w:pPr>
+      <w:r>
+        <w:t xml:space="preserve">Vantagem/Desvantagem: perícias recebem ▲/▼; as demais aparecem no painel “Vantagens &amp; Desvantagens”, com o motivo.</w:t>
+      </w:r>
+    </w:p>
+    <w:p>
+      <w:pPr>
+        <w:pStyle w:val="ListParagraph"/>
+        <w:numPr>
+          <w:ilvl w:val="0"/>
+          <w:numId w:val="2"/>
+        </w:numPr>
+        <w:spacing w:after="60"/>
+      </w:pPr>
+      <w:r>
+        <w:t xml:space="preserve">Penalidade de armadura: médias/pesadas aplicam desvantagem em Furtividade automaticamente.</w:t>
+      </w:r>
+    </w:p>
+    <w:p>
+      <w:pPr>
+        <w:pStyle w:val="ListParagraph"/>
+        <w:numPr>
+          <w:ilvl w:val="0"/>
+          <w:numId w:val="2"/>
+        </w:numPr>
+        <w:spacing w:after="60"/>
+      </w:pPr>
+      <w:r>
+        <w:t xml:space="preserve">Contador de pontos de Qualidades × Defeitos.</w:t>
+      </w:r>
+    </w:p>
+    <w:p>
+      <w:pPr>
+        <w:pStyle w:val="ListParagraph"/>
+        <w:numPr>
+          <w:ilvl w:val="0"/>
+          <w:numId w:val="2"/>
+        </w:numPr>
+        <w:spacing w:after="60"/>
+      </w:pPr>
+      <w:r>
+        <w:t xml:space="preserve">Bônus Personalizados: 5 linhas livres para somar qualquer modificador.</w:t>
+      </w:r>
+    </w:p>
+    <w:p>
+      <w:pPr>
+        <w:pStyle w:val="Heading1"/>
+      </w:pPr>
+      <w:r>
+        <w:t xml:space="preserve">10. Salvamento, compartilhamento e impressão</w:t>
+      </w:r>
+    </w:p>
+    <w:p>
+      <w:pPr>
+        <w:pStyle w:val="ListParagraph"/>
+        <w:numPr>
+          <w:ilvl w:val="0"/>
+          <w:numId w:val="2"/>
+        </w:numPr>
+        <w:spacing w:after="60"/>
+      </w:pPr>
+      <w:r>
+        <w:t xml:space="preserve">Salvamento automático (localStorage) — cada pessoa guarda a própria ficha.</w:t>
+      </w:r>
+    </w:p>
+    <w:p>
+      <w:pPr>
+        <w:pStyle w:val="ListParagraph"/>
+        <w:numPr>
+          <w:ilvl w:val="0"/>
+          <w:numId w:val="2"/>
+        </w:numPr>
+        <w:spacing w:after="60"/>
+      </w:pPr>
+      <w:r>
+        <w:t xml:space="preserve">Exportar / Importar JSON — backup e transferência em arquivo.</w:t>
+      </w:r>
+    </w:p>
+    <w:p>
+      <w:pPr>
+        <w:pStyle w:val="ListParagraph"/>
+        <w:numPr>
+          <w:ilvl w:val="0"/>
+          <w:numId w:val="2"/>
+        </w:numPr>
+        <w:spacing w:after="60"/>
+      </w:pPr>
+      <w:r>
+        <w:t xml:space="preserve">Link da ficha — URL com a ficha embutida (após publicada; cai para JSON se for grande).</w:t>
+      </w:r>
+    </w:p>
+    <w:p>
+      <w:pPr>
+        <w:pStyle w:val="ListParagraph"/>
+        <w:numPr>
+          <w:ilvl w:val="0"/>
+          <w:numId w:val="2"/>
+        </w:numPr>
+        <w:spacing w:after="60"/>
+      </w:pPr>
+      <w:r>
+        <w:t xml:space="preserve">Salvar como PDF — via impressão do navegador, com layout próprio.</w:t>
+      </w:r>
+    </w:p>
+    <w:p>
+      <w:pPr>
+        <w:pStyle w:val="ListParagraph"/>
+        <w:numPr>
+          <w:ilvl w:val="0"/>
+          <w:numId w:val="2"/>
+        </w:numPr>
+        <w:spacing w:after="60"/>
+      </w:pPr>
+      <w:r>
+        <w:t xml:space="preserve">Painel “Descrição dos Itens Escolhidos” — resume cada item selecionado e as habilidades automáticas por nível.</w:t>
+      </w:r>
+    </w:p>
+    <w:p>
+      <w:pPr>
+        <w:pStyle w:val="Heading1"/>
+      </w:pPr>
+      <w:r>
+        <w:t xml:space="preserve">11. Como usar e publicar</w:t>
+      </w:r>
+    </w:p>
+    <w:p>
+      <w:pPr>
+        <w:pStyle w:val="ListParagraph"/>
+        <w:numPr>
+          <w:ilvl w:val="0"/>
+          <w:numId w:val="2"/>
+        </w:numPr>
+        <w:spacing w:after="60"/>
+      </w:pPr>
+      <w:r>
+        <w:t xml:space="preserve">Uso local: duplo-clique no arquivo Ficha-DnD-AliancaDeHerois.html.</w:t>
+      </w:r>
+    </w:p>
+    <w:p>
+      <w:pPr>
+        <w:pStyle w:val="ListParagraph"/>
+        <w:numPr>
+          <w:ilvl w:val="0"/>
+          <w:numId w:val="2"/>
+        </w:numPr>
+        <w:spacing w:after="60"/>
+      </w:pPr>
+      <w:r>
+        <w:t xml:space="preserve">Online: GitHub Pages em jsimaoneto.github.io/Ficha-ProRPG (site estático; cada visitante mantém os próprios dados).</w:t>
+      </w:r>
+    </w:p>
+    <w:p>
+      <w:pPr>
+        <w:pStyle w:val="ListParagraph"/>
+        <w:numPr>
+          <w:ilvl w:val="0"/>
+          <w:numId w:val="2"/>
+        </w:numPr>
+        <w:spacing w:after="60"/>
+      </w:pPr>
+      <w:r>
+        <w:t xml:space="preserve">Compartilhar: envie o link do site; para uma ficha pronta, use “Link da ficha”.</w:t>
+      </w:r>
+    </w:p>
+    <w:p>
+      <w:pPr>
+        <w:pStyle w:val="Heading1"/>
+      </w:pPr>
+      <w:r>
+        <w:t xml:space="preserve">12. Qualidade / testes automatizados</w:t>
+      </w:r>
+    </w:p>
+    <w:p>
+      <w:pPr>
+        <w:spacing w:after="120"/>
+      </w:pPr>
+      <w:r>
+        <w:t xml:space="preserve">O projeto tem testes automatizados (Node.js + jsdom) que validam as regras e a integridade a cada alteração:</w:t>
+      </w:r>
+    </w:p>
+    <w:p>
+      <w:pPr>
+        <w:pStyle w:val="ListParagraph"/>
+        <w:numPr>
+          <w:ilvl w:val="0"/>
+          <w:numId w:val="2"/>
+        </w:numPr>
+        <w:spacing w:after="60"/>
+      </w:pPr>
+      <w:r>
+        <w:t xml:space="preserve">syntax-check.js — sintaxe do JavaScript.</w:t>
+      </w:r>
+    </w:p>
+    <w:p>
+      <w:pPr>
+        <w:pStyle w:val="ListParagraph"/>
+        <w:numPr>
+          <w:ilvl w:val="0"/>
+          <w:numId w:val="2"/>
+        </w:numPr>
+        <w:spacing w:after="60"/>
+      </w:pPr>
+      <w:r>
+        <w:t xml:space="preserve">run-tests.js — repetição, validade por nível, ocultação de escolhidos, subclasse no 3º, soma de multiclasse.</w:t>
+      </w:r>
+    </w:p>
+    <w:p>
+      <w:pPr>
+        <w:pStyle w:val="ListParagraph"/>
+        <w:numPr>
+          <w:ilvl w:val="0"/>
+          <w:numId w:val="2"/>
+        </w:numPr>
+        <w:spacing w:after="60"/>
+      </w:pPr>
+      <w:r>
+        <w:t xml:space="preserve">check-multiclass-sub.js / check-talent-gate.js — subclasse no multiclasse; talentos só na criação.</w:t>
+      </w:r>
+    </w:p>
+    <w:p>
+      <w:pPr>
+        <w:pStyle w:val="ListParagraph"/>
+        <w:numPr>
+          <w:ilvl w:val="0"/>
+          <w:numId w:val="2"/>
+        </w:numPr>
+        <w:spacing w:after="60"/>
+      </w:pPr>
+      <w:r>
+        <w:t xml:space="preserve">check-spells.js / check-grimorio.js — seleção de magias e Grimório (página, dados, resumos).</w:t>
+      </w:r>
+    </w:p>
+    <w:p>
+      <w:pPr>
+        <w:pStyle w:val="ListParagraph"/>
+        <w:numPr>
+          <w:ilvl w:val="0"/>
+          <w:numId w:val="2"/>
+        </w:numPr>
+        <w:spacing w:after="60"/>
+      </w:pPr>
+      <w:r>
+        <w:t xml:space="preserve">audit.js — auditoria geral: erros de runtime, handlers, IDs, cálculos e ciclo salvar/carregar.</w:t>
+      </w:r>
+    </w:p>
+    <w:p>
+      <w:pPr>
+        <w:spacing w:after="120"/>
+      </w:pPr>
+      <w:r>
+        <w:rPr>
+          <w:b/>
+          <w:bCs/>
+        </w:rPr>
         <w:t xml:space="preserve">Última execução: </w:t>
       </w:r>
       <w:r>
-        <w:t xml:space="preserve">todos passando (25/25 · 13/13 · 20/20).</w:t>
+        <w:t xml:space="preserve">113 verificações, 0 falhas, 0 erros de runtime.</w:t>
       </w:r>
     </w:p>
     <w:p>
@@ -2440,7 +2650,7 @@
         <w:pStyle w:val="Heading1"/>
       </w:pPr>
       <w:r>
-        <w:t xml:space="preserve">12. Como estender (manutenção futura)</w:t>
+        <w:t xml:space="preserve">13. Como estender (manutenção futura)</w:t>
       </w:r>
     </w:p>
     <w:p>

</xml_diff>